<commit_message>
Testes de API: navegacao entre etapas, ajuda na tela e documentacao completa
- Botoes "Proxima etapa" no fim de cada tela (os downloads ficam na
  etapa 3 e nao estavam sendo encontrados).
- Expander "O que e e como usar esta area", com o passo a passo para
  exportar collection/environment do Postman.
- Campos de variaveis secretas indicam se sao obrigatorios ou opcionais
  (preenchidos por extracao / sem uso em caso habilitado).
- Texto de ajuda do campo "Contexto da execucao".
- Sobre o app: item, no do diagrama de extras e permissao.
- Guias do Usuario e do Administrador (.docx + PDF regenerados), README,
  documentacao tecnica (.md e .txt).

Co-Authored-By: Claude Opus 5 <noreply@anthropic.com>
</commit_message>
<xml_diff>
--- a/docs/Guia_Administrador.docx
+++ b/docs/Guia_Administrador.docx
@@ -630,7 +630,7 @@
           <w:sz w:val="20"/>
           <w:szCs w:val="20"/>
         </w:rPr>
-        <w:t>Nove funcionalidades do app são liberadas individualmente, por usuário, marcando os checkboxes correspondentes dentro do cadastro de cada pessoa (aba "👤 Usuários", seção 3) — quem não tem a permissão específica nem vê o botão ou passo correspondente. A cobertura é total: nada fica liberado só por a pessoa conseguir logar.</w:t>
+        <w:t>Dez funcionalidades do app são liberadas individualmente, por usuário, marcando os checkboxes correspondentes dentro do cadastro de cada pessoa (aba "👤 Usuários", seção 3) — quem não tem a permissão específica nem vê o botão ou passo correspondente. A cobertura é total: nada fica liberado só por a pessoa conseguir logar.</w:t>
       </w:r>
     </w:p>
     <w:tbl>
@@ -1134,6 +1134,36 @@
           </w:p>
         </w:tc>
       </w:tr>
+      <w:tr>
+        <w:tc>
+          <w:tcPr>
+            <w:tcW w:type="dxa" w:w="2600"/>
+          </w:tcPr>
+          <w:p>
+            <w:r>
+              <w:rPr>
+                <w:b w:val="0"/>
+                <w:sz w:val="18"/>
+              </w:rPr>
+              <w:t>testes_api</w:t>
+            </w:r>
+          </w:p>
+        </w:tc>
+        <w:tc>
+          <w:tcPr>
+            <w:tcW w:type="dxa" w:w="6900"/>
+          </w:tcPr>
+          <w:p>
+            <w:r>
+              <w:rPr>
+                <w:b w:val="0"/>
+                <w:sz w:val="18"/>
+              </w:rPr>
+              <w:t>Testes de API (executar collections do Postman / casos criados na tela e gerar evidências .md/.pdf/.zip)</w:t>
+            </w:r>
+          </w:p>
+        </w:tc>
+      </w:tr>
     </w:tbl>
     <w:p>
       <w:pPr>

</xml_diff>

<commit_message>
Testes de API: execucao pelo navegador do usuario (contorna WAF) + configuracao global do dono
O WAF do HML (CloudFront) bloqueia IPs de provedores de nuvem: Streamlit
Cloud (AWS) e n8n (Oracle SP) recebem 403 "Request blocked"; o IP do
usuario passa. Nenhum proxy em nuvem resolve.

- Componente HTML proprio (ui/components/api_browser_runner) executa as
  requisicoes no navegador de quem usa o app (fetch, variaveis, extracao
  de token) e devolve as respostas brutas; ApiTestRunner.avaliar_execucao_externa
  avalia em Python com a mesma logica da execucao direta.
- Modo de execucao e configuracao GLOBAL (Turso, tabela app_config via
  AppSettingsStore), alterada so pelo dono em Administracao -> aba
  Configuracoes: Navegador (padrao) ou Servidor. Usuarios nao escolhem.
- Testes: avaliacao externa, erro de rede e caso desabilitado.
- README, documentacao tecnica, Sobre o app e Guia do Administrador.

Co-Authored-By: Claude Opus 5 <noreply@anthropic.com>
</commit_message>
<xml_diff>
--- a/docs/Guia_Administrador.docx
+++ b/docs/Guia_Administrador.docx
@@ -98,6 +98,63 @@
           <w:szCs w:val="20"/>
         </w:rPr>
         <w:t xml:space="preserve">4. Permissões Granulares</w:t>
+      </w:r>
+    </w:p>
+    <w:p>
+      <w:pPr>
+        <w:pStyle w:val="Heading2"/>
+        <w:spacing w:after="100" w:before="220"/>
+      </w:pPr>
+      <w:r>
+        <w:rPr>
+          <w:b/>
+          <w:sz w:val="22"/>
+        </w:rPr>
+        <w:t>4.1 Configurações do app (aba ⚙️ Configurações)</w:t>
+      </w:r>
+    </w:p>
+    <w:p>
+      <w:pPr>
+        <w:spacing w:after="120"/>
+      </w:pPr>
+      <w:r>
+        <w:rPr>
+          <w:sz w:val="20"/>
+        </w:rPr>
+        <w:t>Configurações globais — valem para todos os usuários e só o dono altera. Hoje existe uma: de onde saem as chamadas dos Testes de API.</w:t>
+      </w:r>
+    </w:p>
+    <w:p>
+      <w:pPr>
+        <w:spacing w:after="120"/>
+      </w:pPr>
+      <w:r>
+        <w:rPr>
+          <w:sz w:val="20"/>
+        </w:rPr>
+        <w:t>Navegador do usuário (padrão): as requisições são feitas pelo navegador de quem está usando o app, com o IP da pessoa — o mesmo que funciona no Postman. É o modo necessário para o HML, cujo WAF (CloudFront) bloqueia servidores em nuvem (Streamlit Cloud, n8n). Exige que a API aceite CORS a partir do app.</w:t>
+      </w:r>
+    </w:p>
+    <w:p>
+      <w:pPr>
+        <w:spacing w:after="120"/>
+      </w:pPr>
+      <w:r>
+        <w:rPr>
+          <w:sz w:val="20"/>
+        </w:rPr>
+        <w:t>Servidor do app: as requisições saem do Streamlit Cloud. Use para APIs sem bloqueio de origem ou que não permitam CORS.</w:t>
+      </w:r>
+    </w:p>
+    <w:p>
+      <w:pPr>
+        <w:spacing w:after="120"/>
+      </w:pPr>
+      <w:r>
+        <w:rPr>
+          <w:sz w:val="20"/>
+        </w:rPr>
+        <w:t>💡 A mudança vale para todos imediatamente; quem já estiver logado passa a usar o novo modo ao abrir uma nova sessão. Os usuários não escolhem o modo — só veem uma linha informativa na etapa de execução.</w:t>
       </w:r>
     </w:p>
     <w:p>

</xml_diff>